<commit_message>
Fase 3 Pas 2b: panell de puntuació propi al visor de fotos per a "Valoració Repte"
El visor a pantalla completa obert des de "Valoració Repte" compartia el mateix
disparador i cortina que "Resultat Repte" (3 criteris), sense sentit amb el nou
sistema d'1 sol concepte. S'afegeix un disparador ⓘ i panell independents,
ancorats a la mida real de la foto (no de la pantalla), amb una taula
Votants/Puntuació/Posició per Total Vots/Vots Socis/Vots Experts.
"Resultat Repte" queda intacte.

Co-Authored-By: Claude Sonnet 5 <noreply@anthropic.com>
</commit_message>
<xml_diff>
--- a/FEM-Foto_Unificacio_Pla-desenvolupament.docx
+++ b/FEM-Foto_Unificacio_Pla-desenvolupament.docx
@@ -14,7 +14,7 @@
           <w:sz-cs w:val="40"/>
           <w:b/>
           <w:spacing w:val="0"/>
-          <w:color w:val="132035"/>
+          <w:color w:val="101828"/>
         </w:rPr>
         <w:t xml:space="preserve">FEM · Fotografia El Masnou</w:t>
       </w:r>
@@ -24,7 +24,7 @@
           <w:sz w:val="40"/>
           <w:sz-cs w:val="40"/>
           <w:spacing w:val="0"/>
-          <w:color w:val="132035"/>
+          <w:color w:val="101828"/>
         </w:rPr>
         <w:t xml:space="preserve"/>
       </w:r>
@@ -41,7 +41,7 @@
           <w:sz-cs w:val="26"/>
           <w:b/>
           <w:spacing w:val="0"/>
-          <w:color w:val="1F5B35"/>
+          <w:color w:val="1A4A28"/>
         </w:rPr>
         <w:t xml:space="preserve">Unificació de Reptes i Resultats: context i pla de desenvolupament</w:t>
       </w:r>
@@ -51,7 +51,7 @@
           <w:sz w:val="26"/>
           <w:sz-cs w:val="26"/>
           <w:spacing w:val="0"/>
-          <w:color w:val="1F5B35"/>
+          <w:color w:val="1A4A28"/>
         </w:rPr>
         <w:t xml:space="preserve"/>
       </w:r>
@@ -68,7 +68,7 @@
           <w:sz-cs w:val="18"/>
           <w:i/>
           <w:spacing w:val="0"/>
-          <w:color w:val="414141"/>
+          <w:color w:val="323232"/>
         </w:rPr>
         <w:t xml:space="preserve">Document de treball · 24 de juliol de 2026 · Preparat per Claude a partir de FEM-Reptes i FEM-Resultats</w:t>
       </w:r>
@@ -78,7 +78,7 @@
           <w:sz w:val="18"/>
           <w:sz-cs w:val="18"/>
           <w:spacing w:val="0"/>
-          <w:color w:val="414141"/>
+          <w:color w:val="323232"/>
         </w:rPr>
         <w:t xml:space="preserve"/>
       </w:r>
@@ -95,9 +95,9 @@
           <w:sz-cs w:val="18"/>
           <w:i/>
           <w:spacing w:val="0"/>
-          <w:color w:val="414141"/>
-        </w:rPr>
-        <w:t xml:space="preserve">Actualitzat 25 de juliol de 2026 (Pas 2 de la Fase 3) des de la sessió de Claude Code sobre el repo FEM-Foto — vegeu la secció 8.</w:t>
+          <w:color w:val="323232"/>
+        </w:rPr>
+        <w:t xml:space="preserve">Actualitzat 25 de juliol de 2026 (Pas 2b de la Fase 3) des de la sessió de Claude Code sobre el repo FEM-Foto — vegeu la secció 8.</w:t>
       </w:r>
       <w:r>
         <w:rPr>
@@ -105,7 +105,7 @@
           <w:sz w:val="18"/>
           <w:sz-cs w:val="18"/>
           <w:spacing w:val="0"/>
-          <w:color w:val="414141"/>
+          <w:color w:val="323232"/>
         </w:rPr>
         <w:t xml:space="preserve"/>
       </w:r>
@@ -1771,7 +1771,7 @@
           <w:b/>
           <w:spacing w:val="0"/>
         </w:rPr>
-        <w:t xml:space="preserve">Estat (25/07/2026): EN CURS. Pas 1 (columna votes.valoracio + trigger) i Pas 1b (correcció: valoracio es guarda amb decimals, numeric, no arrodonit a enter) fets i verificats a Test i Normal. Pas 2 (pantalla nova «Valoració Repte», en paral·lel a Resultat Repte, només visible per a comptes admin) FET. Pendent: Pas 3 (Classificació General) i, més endavant, el nou control de vot 0–10 a la UI.</w:t>
+        <w:t xml:space="preserve">Estat (25/07/2026): EN CURS. Pas 1 (columna votes.valoracio + trigger) i Pas 1b (correcció: valoracio es guarda amb decimals, numeric, no arrodonit a enter) fets i verificats a Test i Normal. Pas 2 (pantalla nova «Valoració Repte», en paral·lel a Resultat Repte, només visible per a comptes admin) FET. Pas 2b (25/07/2026): panell de puntuació propi al visor de fotos («Valoració Repte»), amb disparador ⓘ ancorat a la mateixa foto (no a la pantalla) i taula Votants/Puntuació/Posició; «Resultat Repte» queda intacte amb la seva estrella i cortina de 3 criteris. FET. Pendent: Pas 3 (Classificació General) i, més endavant, el nou control de vot 0–10 a la UI.</w:t>
       </w:r>
       <w:r>
         <w:rPr>
@@ -2471,7 +2471,7 @@
           <w:sz-cs w:val="24"/>
           <w:spacing w:val="0"/>
         </w:rPr>
-        <w:t xml:space="preserve"> Pas 1: columna votes.valoracio (0–10) afegida i sincronitzada amb un trigger a partir dels 3 criteris antics (sense eliminar-los ni tocar-los), coherent amb la proposta original de la secció 3 (vegeu aclariment). Pas 1b (25/07/2026): es va detectar que tant el trigger com el client (data.js) arrodonien/truncaven a enter, perdent els decimals que la normalització 15→10 hauria de conservar (detectat comparant amb un càlcul manual en full de càlcul) — corregit: valoracio ara es guarda com a numeric amb 2 decimals, backfill refet, i el client ja no trunca cap dels 4 camps de vot (creativity/theme/composition/valoracio). Verificat a Test i Normal, valors coincidents amb el càlcul manual. Pas 2 (25/07/2026): construïda «Valoració Repte», pantalla nova en paral·lel a Resultat Repte (que es manté intacta), amb el mateix disseny de targeta però una barra de progrés 0–10 en lloc d'estrelles; accessible només des del compte admin (nova entrada a la pantalla d'inici), per comparar el nou sistema amb l'actual abans de decidir res més. Pendents: Pas 3 (Classificació General) i, més endavant, el nou control de vot 0–10 a la UI de captura.</w:t>
+        <w:t xml:space="preserve"> Pas 1: columna votes.valoracio (0–10) afegida i sincronitzada amb un trigger a partir dels 3 criteris antics (sense eliminar-los ni tocar-los), coherent amb la proposta original de la secció 3 (vegeu aclariment). Pas 1b (25/07/2026): es va detectar que tant el trigger com el client (data.js) arrodonien/truncaven a enter, perdent els decimals que la normalització 15→10 hauria de conservar (detectat comparant amb un càlcul manual en full de càlcul) — corregit: valoracio ara es guarda com a numeric amb 2 decimals, backfill refet, i el client ja no trunca cap dels 4 camps de vot (creativity/theme/composition/valoracio). Verificat a Test i Normal, valors coincidents amb el càlcul manual. Pas 2 (25/07/2026): construïda «Valoració Repte», pantalla nova en paral·lel a Resultat Repte (que es manté intacta), amb el mateix disseny de targeta però una barra de progrés 0–10 en lloc d'estrelles; accessible només des del compte admin (nova entrada a la pantalla d'inici), per comparar el nou sistema amb l'actual abans de decidir res més. Pas 2b (25/07/2026): el visor de fotos a pantalla completa, obert des de «Valoració Repte», mostrava fins ara la cortina vella de 3 criteris (bug de disseny compartit amb «Resultat Repte»); es va construir un disparador i panell propis i independents per a «Valoració Repte» — icona ⓘ ancorada a la cantonada inferior-esquerra de la pròpia foto (no de la pantalla), i en clicar-hi, una taula compacta amb 3 columnes (Votants/Puntuació/Posició) i 3 files (Total Vots/Vots Socis/Vots Experts). Iterat amb Enric sobre captures reals (tipografia, interlineat, ubicació, estil del disparador). «Resultat Repte» no s'ha tocat. Pendents: Pas 3 (Classificació General) i, més endavant, el nou control de vot 0–10 a la UI de captura.</w:t>
       </w:r>
     </w:p>
     <w:p>
@@ -2533,7 +2533,7 @@
         <w:tab/>
         <w:t xml:space="preserve">•</w:t>
         <w:tab/>
-        <w:t xml:space="preserve">ANALISI_Fase3_Puntuacio.md — anàlisi d'implicacions del nou sistema de puntuació, pla per passos i decisions preses als Pas 1/1b/2.</w:t>
+        <w:t xml:space="preserve">ANALISI_Fase3_Puntuacio.md — anàlisi d'implicacions del nou sistema de puntuació, pla per passos i decisions preses als Pas 1/1b/2/2b.</w:t>
       </w:r>
     </w:p>
     <w:p>

</xml_diff>

<commit_message>
Fase 3 Pas 3: Taula de Classificació + fix d'usuari duplicat (Sancho Pastor)
Pas 3: nova pantalla "Taula de Classificació" en paral·lel a Classificació
General (intacta), amb el mateix motor de punts per posició alimentat per
valoracio en lloc dels 3 criteris. Verificat que dona els mateixos punts i
posicions que l'actual, com s'esperava (assignPositionPoints només depèn de
la posició, no del rang de la nota). Es tanca així el pla per passos de la
Fase 3 acordat el 24/07/2026.

A banda: José Antonio Sancho Pastor tenia dos comptes a `users` (taula
compartida amb l'app "Zampa", fent que sortís duplicat a la Classificació
General. Fusionat a Normal, reassignant la seva foto a l'únic compte amb
activitat real i esborrant la fila buida.

Co-Authored-By: Claude Sonnet 5 <noreply@anthropic.com>
EOF
)
</commit_message>
<xml_diff>
--- a/FEM-Foto_Unificacio_Pla-desenvolupament.docx
+++ b/FEM-Foto_Unificacio_Pla-desenvolupament.docx
@@ -14,7 +14,7 @@
           <w:sz-cs w:val="40"/>
           <w:b/>
           <w:spacing w:val="0"/>
-          <w:color w:val="101828"/>
+          <w:color w:val="0E121E"/>
         </w:rPr>
         <w:t xml:space="preserve">FEM · Fotografia El Masnou</w:t>
       </w:r>
@@ -24,7 +24,7 @@
           <w:sz w:val="40"/>
           <w:sz-cs w:val="40"/>
           <w:spacing w:val="0"/>
-          <w:color w:val="101828"/>
+          <w:color w:val="0E121E"/>
         </w:rPr>
         <w:t xml:space="preserve"/>
       </w:r>
@@ -41,7 +41,7 @@
           <w:sz-cs w:val="26"/>
           <w:b/>
           <w:spacing w:val="0"/>
-          <w:color w:val="1A4A28"/>
+          <w:color w:val="163B1E"/>
         </w:rPr>
         <w:t xml:space="preserve">Unificació de Reptes i Resultats: context i pla de desenvolupament</w:t>
       </w:r>
@@ -51,7 +51,7 @@
           <w:sz w:val="26"/>
           <w:sz-cs w:val="26"/>
           <w:spacing w:val="0"/>
-          <w:color w:val="1A4A28"/>
+          <w:color w:val="163B1E"/>
         </w:rPr>
         <w:t xml:space="preserve"/>
       </w:r>
@@ -68,7 +68,7 @@
           <w:sz-cs w:val="18"/>
           <w:i/>
           <w:spacing w:val="0"/>
-          <w:color w:val="323232"/>
+          <w:color w:val="262626"/>
         </w:rPr>
         <w:t xml:space="preserve">Document de treball · 24 de juliol de 2026 · Preparat per Claude a partir de FEM-Reptes i FEM-Resultats</w:t>
       </w:r>
@@ -78,7 +78,7 @@
           <w:sz w:val="18"/>
           <w:sz-cs w:val="18"/>
           <w:spacing w:val="0"/>
-          <w:color w:val="323232"/>
+          <w:color w:val="262626"/>
         </w:rPr>
         <w:t xml:space="preserve"/>
       </w:r>
@@ -95,9 +95,9 @@
           <w:sz-cs w:val="18"/>
           <w:i/>
           <w:spacing w:val="0"/>
-          <w:color w:val="323232"/>
-        </w:rPr>
-        <w:t xml:space="preserve">Actualitzat 25 de juliol de 2026 (Pas 2b de la Fase 3) des de la sessió de Claude Code sobre el repo FEM-Foto — vegeu la secció 8.</w:t>
+          <w:color w:val="262626"/>
+        </w:rPr>
+        <w:t xml:space="preserve">Actualitzat 25 de juliol de 2026 (Pas 3 de la Fase 3) des de la sessió de Claude Code sobre el repo FEM-Foto — vegeu la secció 8.</w:t>
       </w:r>
       <w:r>
         <w:rPr>
@@ -105,7 +105,7 @@
           <w:sz w:val="18"/>
           <w:sz-cs w:val="18"/>
           <w:spacing w:val="0"/>
-          <w:color w:val="323232"/>
+          <w:color w:val="262626"/>
         </w:rPr>
         <w:t xml:space="preserve"/>
       </w:r>
@@ -1771,7 +1771,7 @@
           <w:b/>
           <w:spacing w:val="0"/>
         </w:rPr>
-        <w:t xml:space="preserve">Estat (25/07/2026): EN CURS. Pas 1 (columna votes.valoracio + trigger) i Pas 1b (correcció: valoracio es guarda amb decimals, numeric, no arrodonit a enter) fets i verificats a Test i Normal. Pas 2 (pantalla nova «Valoració Repte», en paral·lel a Resultat Repte, només visible per a comptes admin) FET. Pas 2b (25/07/2026): panell de puntuació propi al visor de fotos («Valoració Repte»), amb disparador ⓘ ancorat a la mateixa foto (no a la pantalla) i taula Votants/Puntuació/Posició; «Resultat Repte» queda intacte amb la seva estrella i cortina de 3 criteris. FET. Pendent: Pas 3 (Classificació General) i, més endavant, el nou control de vot 0–10 a la UI.</w:t>
+        <w:t xml:space="preserve">Estat (25/07/2026): EN CURS. Pas 1 (columna votes.valoracio + trigger) i Pas 1b (correcció: valoracio es guarda amb decimals, numeric, no arrodonit a enter) fets i verificats a Test i Normal. Pas 2 (pantalla nova «Valoració Repte», en paral·lel a Resultat Repte, només visible per a comptes admin) FET. Pas 2b (25/07/2026): panell de puntuació propi al visor de fotos («Valoració Repte»), amb disparador ⓘ ancorat a la mateixa foto (no a la pantalla) i taula Votants/Puntuació/Posició; «Resultat Repte» queda intacte amb la seva estrella i cortina de 3 criteris. FET. Pas 3 (25/07/2026): «Taula de Classificació», pantalla nova en paral·lel a Classificació General (intacta), amb el mateix motor de punts per posició alimentat per valoracio en lloc dels 3 criteris — verificat per Enric que dona els mateixos punts i posicions que l'actual, com s'esperava. FET. Fase 3, pla per passos acordat, tancada; pendent només el nou control de vot 0–10 a la UI de captura i el redisseny de les pantalles de resultat, sense calendaritzar encara.</w:t>
       </w:r>
       <w:r>
         <w:rPr>
@@ -2210,87 +2210,54 @@
         <w:tab/>
         <w:t xml:space="preserve">•</w:t>
         <w:tab/>
-        <w:t xml:space="preserve">[Nou, detectat 24/07/2026]</w:t>
-      </w:r>
-      <w:r>
-        <w:rPr>
-          <w:rFonts w:ascii="Times" w:hAnsi="Times" w:cs="Times"/>
-          <w:sz w:val="24"/>
-          <w:sz-cs w:val="24"/>
-          <w:spacing w:val="0"/>
-        </w:rPr>
-        <w:t xml:space="preserve"> El camp </w:t>
-      </w:r>
-      <w:r>
-        <w:rPr>
-          <w:rFonts w:ascii="Times" w:hAnsi="Times" w:cs="Times"/>
-          <w:sz w:val="24"/>
-          <w:sz-cs w:val="24"/>
-          <w:b/>
-          <w:spacing w:val="0"/>
-        </w:rPr>
-        <w:t xml:space="preserve">users.password</w:t>
-      </w:r>
-      <w:r>
-        <w:rPr>
-          <w:rFonts w:ascii="Times" w:hAnsi="Times" w:cs="Times"/>
-          <w:sz w:val="24"/>
-          <w:sz-cs w:val="24"/>
-          <w:spacing w:val="0"/>
-        </w:rPr>
-        <w:t xml:space="preserve"> es llegeix/escriu en clar des del client (sense hash). Ja identificat per Enric com a canvi pendent, fora de l'abast d'aquesta unificació.</w:t>
-      </w:r>
-    </w:p>
-    <w:p>
-      <w:pPr>
-        <w:spacing w:after="160"/>
-      </w:pPr>
-      <w:r>
-        <w:rPr>
-          <w:rFonts w:ascii="Times" w:hAnsi="Times" w:cs="Times"/>
-          <w:sz w:val="24"/>
-          <w:sz-cs w:val="24"/>
-          <w:spacing w:val="0"/>
-        </w:rPr>
-        <w:t xml:space="preserve">7. Propers passos immediats</w:t>
-      </w:r>
-    </w:p>
-    <w:p>
-      <w:pPr>
-        <w:spacing w:after="160"/>
-      </w:pPr>
-      <w:r>
-        <w:rPr>
-          <w:rFonts w:ascii="Times" w:hAnsi="Times" w:cs="Times"/>
-          <w:sz w:val="24"/>
-          <w:sz-cs w:val="24"/>
-          <w:i/>
-          <w:spacing w:val="0"/>
-        </w:rPr>
-        <w:t xml:space="preserve">Nota (25/07/2026): aquests 5 passos de bastida ja s'han completat (el repo GitHub existeix i el desenvolupament ja avança dins seu, en Fase 2 i 3). Es mantenen a sota com a historial. Per a l'estat real i el proper pas, vegeu la secció 8.</w:t>
-      </w:r>
-      <w:r>
-        <w:rPr>
-          <w:rFonts w:ascii="Times" w:hAnsi="Times" w:cs="Times"/>
-          <w:sz w:val="24"/>
-          <w:sz-cs w:val="24"/>
-          <w:spacing w:val="0"/>
-        </w:rPr>
-        <w:t xml:space="preserve"/>
-      </w:r>
-    </w:p>
-    <w:p>
-      <w:pPr>
-        <w:spacing w:after="160"/>
-      </w:pPr>
-      <w:r>
-        <w:rPr>
-          <w:rFonts w:ascii="Times" w:hAnsi="Times" w:cs="Times"/>
-          <w:sz w:val="24"/>
-          <w:sz-cs w:val="24"/>
-          <w:spacing w:val="0"/>
-        </w:rPr>
-        <w:t xml:space="preserve">A partir d'aquí, t'aniré guiant pas a pas pel xat, un pas a la vegada:</w:t>
+        <w:t xml:space="preserve">[Nou, detectat i resolt 25/07/2026]</w:t>
+      </w:r>
+      <w:r>
+        <w:rPr>
+          <w:rFonts w:ascii="Times" w:hAnsi="Times" w:cs="Times"/>
+          <w:sz w:val="24"/>
+          <w:sz-cs w:val="24"/>
+          <w:spacing w:val="0"/>
+        </w:rPr>
+        <w:t xml:space="preserve"> Manifestació concreta del risc anterior: José Antonio Sancho Pastor tenia dos comptes a </w:t>
+      </w:r>
+      <w:r>
+        <w:rPr>
+          <w:rFonts w:ascii="Times" w:hAnsi="Times" w:cs="Times"/>
+          <w:sz w:val="24"/>
+          <w:sz-cs w:val="24"/>
+          <w:b/>
+          <w:spacing w:val="0"/>
+        </w:rPr>
+        <w:t xml:space="preserve">users</w:t>
+      </w:r>
+      <w:r>
+        <w:rPr>
+          <w:rFonts w:ascii="Times" w:hAnsi="Times" w:cs="Times"/>
+          <w:sz w:val="24"/>
+          <w:sz-cs w:val="24"/>
+          <w:spacing w:val="0"/>
+        </w:rPr>
+        <w:t xml:space="preserve"> (un per email diferent, cadascun amb activitat real repartida entre Reptes/Foto i Zampa), fent que sortís duplicat a la Classificació General. Fusionat a Normal (</w:t>
+      </w:r>
+      <w:r>
+        <w:rPr>
+          <w:rFonts w:ascii="Times" w:hAnsi="Times" w:cs="Times"/>
+          <w:sz w:val="24"/>
+          <w:sz-cs w:val="24"/>
+          <w:b/>
+          <w:spacing w:val="0"/>
+        </w:rPr>
+        <w:t xml:space="preserve">sql/2026-07-25_merge_duplicate_user_sancho.sql</w:t>
+      </w:r>
+      <w:r>
+        <w:rPr>
+          <w:rFonts w:ascii="Times" w:hAnsi="Times" w:cs="Times"/>
+          <w:sz w:val="24"/>
+          <w:sz-cs w:val="24"/>
+          <w:spacing w:val="0"/>
+        </w:rPr>
+        <w:t xml:space="preserve">): reassignada la seva foto a l'únic compte amb activitat real i esborrada la fila buida. Es va detectar el mateix patró, encara sense resoldre a petició d'Enric, per a Harald Hausleithner — actualment inofensiu perquè el segon compte només té dades de Zampa.</w:t>
       </w:r>
     </w:p>
     <w:p>
@@ -2303,13 +2270,94 @@
           <w:rFonts w:ascii="Times" w:hAnsi="Times" w:cs="Times"/>
           <w:sz w:val="24"/>
           <w:sz-cs w:val="24"/>
+          <w:b/>
           <w:spacing w:val="0"/>
         </w:rPr>
         <w:t xml:space="preserve"/>
         <w:tab/>
         <w:t xml:space="preserve">•</w:t>
         <w:tab/>
-        <w:t xml:space="preserve">Pas 1 — Confirmar el nom del repositori/projecte (proposta: FEM-Foto o FEM-Fotografia-El-Masnou) i crear-lo a GitHub, sota l'organització FEMFotografiaElMasnou.</w:t>
+        <w:t xml:space="preserve">[Nou, detectat 24/07/2026]</w:t>
+      </w:r>
+      <w:r>
+        <w:rPr>
+          <w:rFonts w:ascii="Times" w:hAnsi="Times" w:cs="Times"/>
+          <w:sz w:val="24"/>
+          <w:sz-cs w:val="24"/>
+          <w:spacing w:val="0"/>
+        </w:rPr>
+        <w:t xml:space="preserve"> El camp </w:t>
+      </w:r>
+      <w:r>
+        <w:rPr>
+          <w:rFonts w:ascii="Times" w:hAnsi="Times" w:cs="Times"/>
+          <w:sz w:val="24"/>
+          <w:sz-cs w:val="24"/>
+          <w:b/>
+          <w:spacing w:val="0"/>
+        </w:rPr>
+        <w:t xml:space="preserve">users.password</w:t>
+      </w:r>
+      <w:r>
+        <w:rPr>
+          <w:rFonts w:ascii="Times" w:hAnsi="Times" w:cs="Times"/>
+          <w:sz w:val="24"/>
+          <w:sz-cs w:val="24"/>
+          <w:spacing w:val="0"/>
+        </w:rPr>
+        <w:t xml:space="preserve"> es llegeix/escriu en clar des del client (sense hash). Ja identificat per Enric com a canvi pendent, fora de l'abast d'aquesta unificació.</w:t>
+      </w:r>
+    </w:p>
+    <w:p>
+      <w:pPr>
+        <w:spacing w:after="160"/>
+      </w:pPr>
+      <w:r>
+        <w:rPr>
+          <w:rFonts w:ascii="Times" w:hAnsi="Times" w:cs="Times"/>
+          <w:sz w:val="24"/>
+          <w:sz-cs w:val="24"/>
+          <w:spacing w:val="0"/>
+        </w:rPr>
+        <w:t xml:space="preserve">7. Propers passos immediats</w:t>
+      </w:r>
+    </w:p>
+    <w:p>
+      <w:pPr>
+        <w:spacing w:after="160"/>
+      </w:pPr>
+      <w:r>
+        <w:rPr>
+          <w:rFonts w:ascii="Times" w:hAnsi="Times" w:cs="Times"/>
+          <w:sz w:val="24"/>
+          <w:sz-cs w:val="24"/>
+          <w:i/>
+          <w:spacing w:val="0"/>
+        </w:rPr>
+        <w:t xml:space="preserve">Nota (25/07/2026): aquests 5 passos de bastida ja s'han completat (el repo GitHub existeix i el desenvolupament ja avança dins seu, en Fase 2 i 3). Es mantenen a sota com a historial. Per a l'estat real i el proper pas, vegeu la secció 8.</w:t>
+      </w:r>
+      <w:r>
+        <w:rPr>
+          <w:rFonts w:ascii="Times" w:hAnsi="Times" w:cs="Times"/>
+          <w:sz w:val="24"/>
+          <w:sz-cs w:val="24"/>
+          <w:spacing w:val="0"/>
+        </w:rPr>
+        <w:t xml:space="preserve"/>
+      </w:r>
+    </w:p>
+    <w:p>
+      <w:pPr>
+        <w:spacing w:after="160"/>
+      </w:pPr>
+      <w:r>
+        <w:rPr>
+          <w:rFonts w:ascii="Times" w:hAnsi="Times" w:cs="Times"/>
+          <w:sz w:val="24"/>
+          <w:sz-cs w:val="24"/>
+          <w:spacing w:val="0"/>
+        </w:rPr>
+        <w:t xml:space="preserve">A partir d'aquí, t'aniré guiant pas a pas pel xat, un pas a la vegada:</w:t>
       </w:r>
     </w:p>
     <w:p>
@@ -2328,7 +2376,7 @@
         <w:tab/>
         <w:t xml:space="preserve">•</w:t>
         <w:tab/>
-        <w:t xml:space="preserve">Pas 2 — Crear el projecte Vercel nou i connectar-lo al repo, sense domini.</w:t>
+        <w:t xml:space="preserve">Pas 1 — Confirmar el nom del repositori/projecte (proposta: FEM-Foto o FEM-Fotografia-El-Masnou) i crear-lo a GitHub, sota l'organització FEMFotografiaElMasnou.</w:t>
       </w:r>
     </w:p>
     <w:p>
@@ -2347,7 +2395,7 @@
         <w:tab/>
         <w:t xml:space="preserve">•</w:t>
         <w:tab/>
-        <w:t xml:space="preserve">Pas 3 — Clonar FEM-Reptes com a punt de partida dins el nou repositori.</w:t>
+        <w:t xml:space="preserve">Pas 2 — Crear el projecte Vercel nou i connectar-lo al repo, sense domini.</w:t>
       </w:r>
     </w:p>
     <w:p>
@@ -2366,7 +2414,7 @@
         <w:tab/>
         <w:t xml:space="preserve">•</w:t>
         <w:tab/>
-        <w:t xml:space="preserve">Pas 4 — Configurar les variables d'entorn (Supabase Normal/Test, Cloudinary) al nou projecte.</w:t>
+        <w:t xml:space="preserve">Pas 3 — Clonar FEM-Reptes com a punt de partida dins el nou repositori.</w:t>
       </w:r>
     </w:p>
     <w:p>
@@ -2385,117 +2433,7 @@
         <w:tab/>
         <w:t xml:space="preserve">•</w:t>
         <w:tab/>
-        <w:t xml:space="preserve">Pas 5 — Obrir Claude Code sobre el nou repo i començar la Fase 2 (integració nativa de Resultats).</w:t>
-      </w:r>
-    </w:p>
-    <w:p>
-      <w:pPr>
-        <w:spacing w:after="160"/>
-      </w:pPr>
-      <w:r>
-        <w:rPr>
-          <w:rFonts w:ascii="Times" w:hAnsi="Times" w:cs="Times"/>
-          <w:sz w:val="24"/>
-          <w:sz-cs w:val="24"/>
-          <w:spacing w:val="0"/>
-        </w:rPr>
-        <w:t xml:space="preserve">8. Estat actual (actualitzat 25 de juliol de 2026)</w:t>
-      </w:r>
-    </w:p>
-    <w:p>
-      <w:pPr>
-        <w:spacing w:after="160"/>
-      </w:pPr>
-      <w:r>
-        <w:rPr>
-          <w:rFonts w:ascii="Times" w:hAnsi="Times" w:cs="Times"/>
-          <w:sz w:val="24"/>
-          <w:sz-cs w:val="24"/>
-          <w:b/>
-          <w:spacing w:val="0"/>
-        </w:rPr>
-        <w:t xml:space="preserve">Fase 1 — Bastida:</w:t>
-      </w:r>
-      <w:r>
-        <w:rPr>
-          <w:rFonts w:ascii="Times" w:hAnsi="Times" w:cs="Times"/>
-          <w:sz w:val="24"/>
-          <w:sz-cs w:val="24"/>
-          <w:spacing w:val="0"/>
-        </w:rPr>
-        <w:t xml:space="preserve"> repo GitHub FEMFotografiaElMasnou/FEM-Foto creat i connectat (origin/main). Projecte Vercel i variables d'entorn: pendents de confirmar amb Enric (no verificable des de la sessió de Claude Code).</w:t>
-      </w:r>
-    </w:p>
-    <w:p>
-      <w:pPr>
-        <w:spacing w:after="160"/>
-      </w:pPr>
-      <w:r>
-        <w:rPr>
-          <w:rFonts w:ascii="Times" w:hAnsi="Times" w:cs="Times"/>
-          <w:sz w:val="24"/>
-          <w:sz-cs w:val="24"/>
-          <w:b/>
-          <w:spacing w:val="0"/>
-        </w:rPr>
-        <w:t xml:space="preserve">Fase 2 — Integració nativa de Resultats: FETA i validada per Enric.</w:t>
-      </w:r>
-      <w:r>
-        <w:rPr>
-          <w:rFonts w:ascii="Times" w:hAnsi="Times" w:cs="Times"/>
-          <w:sz w:val="24"/>
-          <w:sz-cs w:val="24"/>
-          <w:spacing w:val="0"/>
-        </w:rPr>
-        <w:t xml:space="preserve"> Resultat Repte i Classificació General són pantalles natives (sense iframe), amb selector de vot Tots/Socis/Expert i l'estètica calcada de FEM-Resultats. RESULTATS_BASE i tot el codi de l'iframe retirats.</w:t>
-      </w:r>
-    </w:p>
-    <w:p>
-      <w:pPr>
-        <w:spacing w:after="160"/>
-      </w:pPr>
-      <w:r>
-        <w:rPr>
-          <w:rFonts w:ascii="Times" w:hAnsi="Times" w:cs="Times"/>
-          <w:sz w:val="24"/>
-          <w:sz-cs w:val="24"/>
-          <w:b/>
-          <w:spacing w:val="0"/>
-        </w:rPr>
-        <w:t xml:space="preserve">Fase 3 — Nou sistema de puntuació: EN CURS.</w:t>
-      </w:r>
-      <w:r>
-        <w:rPr>
-          <w:rFonts w:ascii="Times" w:hAnsi="Times" w:cs="Times"/>
-          <w:sz w:val="24"/>
-          <w:sz-cs w:val="24"/>
-          <w:spacing w:val="0"/>
-        </w:rPr>
-        <w:t xml:space="preserve"> Pas 1: columna votes.valoracio (0–10) afegida i sincronitzada amb un trigger a partir dels 3 criteris antics (sense eliminar-los ni tocar-los), coherent amb la proposta original de la secció 3 (vegeu aclariment). Pas 1b (25/07/2026): es va detectar que tant el trigger com el client (data.js) arrodonien/truncaven a enter, perdent els decimals que la normalització 15→10 hauria de conservar (detectat comparant amb un càlcul manual en full de càlcul) — corregit: valoracio ara es guarda com a numeric amb 2 decimals, backfill refet, i el client ja no trunca cap dels 4 camps de vot (creativity/theme/composition/valoracio). Verificat a Test i Normal, valors coincidents amb el càlcul manual. Pas 2 (25/07/2026): construïda «Valoració Repte», pantalla nova en paral·lel a Resultat Repte (que es manté intacta), amb el mateix disseny de targeta però una barra de progrés 0–10 en lloc d'estrelles; accessible només des del compte admin (nova entrada a la pantalla d'inici), per comparar el nou sistema amb l'actual abans de decidir res més. Pas 2b (25/07/2026): el visor de fotos a pantalla completa, obert des de «Valoració Repte», mostrava fins ara la cortina vella de 3 criteris (bug de disseny compartit amb «Resultat Repte»); es va construir un disparador i panell propis i independents per a «Valoració Repte» — icona ⓘ ancorada a la cantonada inferior-esquerra de la pròpia foto (no de la pantalla), i en clicar-hi, una taula compacta amb 3 columnes (Votants/Puntuació/Posició) i 3 files (Total Vots/Vots Socis/Vots Experts). Iterat amb Enric sobre captures reals (tipografia, interlineat, ubicació, estil del disparador). «Resultat Repte» no s'ha tocat. Pendents: Pas 3 (Classificació General) i, més endavant, el nou control de vot 0–10 a la UI de captura.</w:t>
-      </w:r>
-    </w:p>
-    <w:p>
-      <w:pPr>
-        <w:spacing w:after="160"/>
-      </w:pPr>
-      <w:r>
-        <w:rPr>
-          <w:rFonts w:ascii="Times" w:hAnsi="Times" w:cs="Times"/>
-          <w:sz w:val="24"/>
-          <w:sz-cs w:val="24"/>
-          <w:b/>
-          <w:spacing w:val="0"/>
-        </w:rPr>
-        <w:t xml:space="preserve">Documents de treball relacionats (dins del repo FEM-Foto):</w:t>
-      </w:r>
-      <w:r>
-        <w:rPr>
-          <w:rFonts w:ascii="Times" w:hAnsi="Times" w:cs="Times"/>
-          <w:sz w:val="24"/>
-          <w:sz-cs w:val="24"/>
-          <w:spacing w:val="0"/>
-        </w:rPr>
-        <w:t xml:space="preserve"/>
+        <w:t xml:space="preserve">Pas 4 — Configurar les variables d'entorn (Supabase Normal/Test, Cloudinary) al nou projecte.</w:t>
       </w:r>
     </w:p>
     <w:p>
@@ -2514,7 +2452,117 @@
         <w:tab/>
         <w:t xml:space="preserve">•</w:t>
         <w:tab/>
-        <w:t xml:space="preserve">HANDOFF_Fase2_Resultats.md — detall tècnic de la integració nativa de Resultats (Fase 2).</w:t>
+        <w:t xml:space="preserve">Pas 5 — Obrir Claude Code sobre el nou repo i començar la Fase 2 (integració nativa de Resultats).</w:t>
+      </w:r>
+    </w:p>
+    <w:p>
+      <w:pPr>
+        <w:spacing w:after="160"/>
+      </w:pPr>
+      <w:r>
+        <w:rPr>
+          <w:rFonts w:ascii="Times" w:hAnsi="Times" w:cs="Times"/>
+          <w:sz w:val="24"/>
+          <w:sz-cs w:val="24"/>
+          <w:spacing w:val="0"/>
+        </w:rPr>
+        <w:t xml:space="preserve">8. Estat actual (actualitzat 25 de juliol de 2026)</w:t>
+      </w:r>
+    </w:p>
+    <w:p>
+      <w:pPr>
+        <w:spacing w:after="160"/>
+      </w:pPr>
+      <w:r>
+        <w:rPr>
+          <w:rFonts w:ascii="Times" w:hAnsi="Times" w:cs="Times"/>
+          <w:sz w:val="24"/>
+          <w:sz-cs w:val="24"/>
+          <w:b/>
+          <w:spacing w:val="0"/>
+        </w:rPr>
+        <w:t xml:space="preserve">Fase 1 — Bastida:</w:t>
+      </w:r>
+      <w:r>
+        <w:rPr>
+          <w:rFonts w:ascii="Times" w:hAnsi="Times" w:cs="Times"/>
+          <w:sz w:val="24"/>
+          <w:sz-cs w:val="24"/>
+          <w:spacing w:val="0"/>
+        </w:rPr>
+        <w:t xml:space="preserve"> repo GitHub FEMFotografiaElMasnou/FEM-Foto creat i connectat (origin/main). Projecte Vercel i variables d'entorn: pendents de confirmar amb Enric (no verificable des de la sessió de Claude Code).</w:t>
+      </w:r>
+    </w:p>
+    <w:p>
+      <w:pPr>
+        <w:spacing w:after="160"/>
+      </w:pPr>
+      <w:r>
+        <w:rPr>
+          <w:rFonts w:ascii="Times" w:hAnsi="Times" w:cs="Times"/>
+          <w:sz w:val="24"/>
+          <w:sz-cs w:val="24"/>
+          <w:b/>
+          <w:spacing w:val="0"/>
+        </w:rPr>
+        <w:t xml:space="preserve">Fase 2 — Integració nativa de Resultats: FETA i validada per Enric.</w:t>
+      </w:r>
+      <w:r>
+        <w:rPr>
+          <w:rFonts w:ascii="Times" w:hAnsi="Times" w:cs="Times"/>
+          <w:sz w:val="24"/>
+          <w:sz-cs w:val="24"/>
+          <w:spacing w:val="0"/>
+        </w:rPr>
+        <w:t xml:space="preserve"> Resultat Repte i Classificació General són pantalles natives (sense iframe), amb selector de vot Tots/Socis/Expert i l'estètica calcada de FEM-Resultats. RESULTATS_BASE i tot el codi de l'iframe retirats.</w:t>
+      </w:r>
+    </w:p>
+    <w:p>
+      <w:pPr>
+        <w:spacing w:after="160"/>
+      </w:pPr>
+      <w:r>
+        <w:rPr>
+          <w:rFonts w:ascii="Times" w:hAnsi="Times" w:cs="Times"/>
+          <w:sz w:val="24"/>
+          <w:sz-cs w:val="24"/>
+          <w:b/>
+          <w:spacing w:val="0"/>
+        </w:rPr>
+        <w:t xml:space="preserve">Fase 3 — Nou sistema de puntuació: EN CURS.</w:t>
+      </w:r>
+      <w:r>
+        <w:rPr>
+          <w:rFonts w:ascii="Times" w:hAnsi="Times" w:cs="Times"/>
+          <w:sz w:val="24"/>
+          <w:sz-cs w:val="24"/>
+          <w:spacing w:val="0"/>
+        </w:rPr>
+        <w:t xml:space="preserve"> Pas 1: columna votes.valoracio (0–10) afegida i sincronitzada amb un trigger a partir dels 3 criteris antics (sense eliminar-los ni tocar-los), coherent amb la proposta original de la secció 3 (vegeu aclariment). Pas 1b (25/07/2026): es va detectar que tant el trigger com el client (data.js) arrodonien/truncaven a enter, perdent els decimals que la normalització 15→10 hauria de conservar (detectat comparant amb un càlcul manual en full de càlcul) — corregit: valoracio ara es guarda com a numeric amb 2 decimals, backfill refet, i el client ja no trunca cap dels 4 camps de vot (creativity/theme/composition/valoracio). Verificat a Test i Normal, valors coincidents amb el càlcul manual. Pas 2 (25/07/2026): construïda «Valoració Repte», pantalla nova en paral·lel a Resultat Repte (que es manté intacta), amb el mateix disseny de targeta però una barra de progrés 0–10 en lloc d'estrelles; accessible només des del compte admin (nova entrada a la pantalla d'inici), per comparar el nou sistema amb l'actual abans de decidir res més. Pas 2b (25/07/2026): el visor de fotos a pantalla completa, obert des de «Valoració Repte», mostrava fins ara la cortina vella de 3 criteris (bug de disseny compartit amb «Resultat Repte»); es va construir un disparador i panell propis i independents per a «Valoració Repte» — icona ⓘ ancorada a la cantonada inferior-esquerra de la pròpia foto (no de la pantalla), i en clicar-hi, una taula compacta amb 3 columnes (Votants/Puntuació/Posició) i 3 files (Total Vots/Vots Socis/Vots Experts). Iterat amb Enric sobre captures reals (tipografia, interlineat, ubicació, estil del disparador). «Resultat Repte» no s'ha tocat. Pas 3 (25/07/2026): confirmada la hipòtesi que l'assignació de punts per posició no depèn del rang de la nota (només detecta empats per igualtat) — es va construir «Taula de Classificació», pantalla nova en paral·lel a Classificació General (que es manté intacta), mateix motor de punts alimentat per valoracio en lloc dels 3 criteris, amagada rere el mateix gate d'admin real que «Valoració Repte». Enric ho ha provat en viu i confirma que dona exactament els mateixos punts i posicions que l'actual Classificació General, el resultat matemàticament esperat. Amb això es tanca el pla per passos de la Fase 3 acordat el 24/07/2026; queden pendents de calendaritzar el nou control de vot 0–10 a la UI de captura i el redisseny de les pantalles de resultat.</w:t>
+      </w:r>
+    </w:p>
+    <w:p>
+      <w:pPr>
+        <w:spacing w:after="160"/>
+      </w:pPr>
+      <w:r>
+        <w:rPr>
+          <w:rFonts w:ascii="Times" w:hAnsi="Times" w:cs="Times"/>
+          <w:sz w:val="24"/>
+          <w:sz-cs w:val="24"/>
+          <w:b/>
+          <w:spacing w:val="0"/>
+        </w:rPr>
+        <w:t xml:space="preserve">Documents de treball relacionats (dins del repo FEM-Foto):</w:t>
+      </w:r>
+      <w:r>
+        <w:rPr>
+          <w:rFonts w:ascii="Times" w:hAnsi="Times" w:cs="Times"/>
+          <w:sz w:val="24"/>
+          <w:sz-cs w:val="24"/>
+          <w:spacing w:val="0"/>
+        </w:rPr>
+        <w:t xml:space="preserve"/>
       </w:r>
     </w:p>
     <w:p>
@@ -2533,7 +2581,7 @@
         <w:tab/>
         <w:t xml:space="preserve">•</w:t>
         <w:tab/>
-        <w:t xml:space="preserve">ANALISI_Fase3_Puntuacio.md — anàlisi d'implicacions del nou sistema de puntuació, pla per passos i decisions preses als Pas 1/1b/2/2b.</w:t>
+        <w:t xml:space="preserve">HANDOFF_Fase2_Resultats.md — detall tècnic de la integració nativa de Resultats (Fase 2).</w:t>
       </w:r>
     </w:p>
     <w:p>
@@ -2552,7 +2600,7 @@
         <w:tab/>
         <w:t xml:space="preserve">•</w:t>
         <w:tab/>
-        <w:t xml:space="preserve">sql/2026-07-24_fase3_valoracio_pas1.sql — migració SQL del Pas 1, ja aplicada a Test i Normal.</w:t>
+        <w:t xml:space="preserve">ANALISI_Fase3_Puntuacio.md — anàlisi d'implicacions del nou sistema de puntuació, pla per passos i decisions preses als Pas 1/1b/2/2b.</w:t>
       </w:r>
     </w:p>
     <w:p>
@@ -2571,6 +2619,25 @@
         <w:tab/>
         <w:t xml:space="preserve">•</w:t>
         <w:tab/>
+        <w:t xml:space="preserve">sql/2026-07-24_fase3_valoracio_pas1.sql — migració SQL del Pas 1, ja aplicada a Test i Normal.</w:t>
+      </w:r>
+    </w:p>
+    <w:p>
+      <w:pPr>
+        <w:ind w:left="720" w:first-line="-720"/>
+        <w:spacing w:after="90"/>
+      </w:pPr>
+      <w:r>
+        <w:rPr>
+          <w:rFonts w:ascii="Times" w:hAnsi="Times" w:cs="Times"/>
+          <w:sz w:val="24"/>
+          <w:sz-cs w:val="24"/>
+          <w:spacing w:val="0"/>
+        </w:rPr>
+        <w:t xml:space="preserve"/>
+        <w:tab/>
+        <w:t xml:space="preserve">•</w:t>
+        <w:tab/>
         <w:t xml:space="preserve">sql/2026-07-25_fase3_valoracio_pas1b_decimals.sql — migració SQL del Pas 1b (correcció de precisió), ja aplicada a Test i Normal.</w:t>
       </w:r>
     </w:p>
@@ -2595,7 +2662,7 @@
           <w:sz-cs w:val="24"/>
           <w:spacing w:val="0"/>
         </w:rPr>
-        <w:t xml:space="preserve"> analitzar i, amb el vist-i-plau d'Enric, aplicar el Pas 3 de la Fase 3 (adaptació de la Classificació General al nou sistema de puntuació).</w:t>
+        <w:t xml:space="preserve"> el pla per passos de la Fase 3 (Pas 1/1b/2/2b/3) està tancat. Queda per decidir, sense calendaritzar encara, per on continuar: el nou control de vot 0–10 a la UI de captura (substituint les estrelles), el redisseny de les pantalles de resultat per al sistema d'1 sol concepte, i el moment del tall per als reptes amb votació oberta.</w:t>
       </w:r>
     </w:p>
     <w:sectPr/>

</xml_diff>